<commit_message>
Note de tenue sous charge remesurée après l'ajout de la copie PDF/A
La copie d'archivage coûte 3,2 à 3,5 ms par enregistrement et ce coût ne
bouge pas avec le volume de la base. L'archive complète passe de 1,82 s à
1,94 s à la plus grande échelle — du même ordre que la dispersion entre deux
exécutions.

Co-Authored-By: Claude Opus 5 <noreply@anthropic.com>
</commit_message>
<xml_diff>
--- a/docs/Filum_load_behaviour_note.docx
+++ b/docs/Filum_load_behaviour_note.docx
@@ -653,53 +653,53 @@
                 <w:sz w:val="17"/>
                 <w:szCs w:val="17"/>
               </w:rPr>
-              <w:t xml:space="preserve">14.7 ms  (21.8 ms)</w:t>
-            </w:r>
-          </w:p>
-        </w:tc>
-        <w:tc>
-          <w:tcPr>
-            <w:tcW w:type="pct" w:w="14%"/>
-            <w:tcMar>
-              <w:top w:type="dxa" w:w="80"/>
-              <w:left w:type="dxa" w:w="110"/>
-              <w:bottom w:type="dxa" w:w="80"/>
-              <w:right w:type="dxa" w:w="110"/>
-            </w:tcMar>
-          </w:tcPr>
-          <w:p>
-            <w:pPr>
-              <w:spacing w:after="0"/>
-            </w:pPr>
-            <w:r>
-              <w:rPr>
-                <w:sz w:val="17"/>
-                <w:szCs w:val="17"/>
-              </w:rPr>
-              <w:t xml:space="preserve">154 ms  (165.1 ms)</w:t>
-            </w:r>
-          </w:p>
-        </w:tc>
-        <w:tc>
-          <w:tcPr>
-            <w:tcW w:type="pct" w:w="14%"/>
-            <w:tcMar>
-              <w:top w:type="dxa" w:w="80"/>
-              <w:left w:type="dxa" w:w="110"/>
-              <w:bottom w:type="dxa" w:w="80"/>
-              <w:right w:type="dxa" w:w="110"/>
-            </w:tcMar>
-          </w:tcPr>
-          <w:p>
-            <w:pPr>
-              <w:spacing w:after="0"/>
-            </w:pPr>
-            <w:r>
-              <w:rPr>
-                <w:sz w:val="17"/>
-                <w:szCs w:val="17"/>
-              </w:rPr>
-              <w:t xml:space="preserve">802.3 ms  (862.5 ms)</w:t>
+              <w:t xml:space="preserve">15.7 ms  (17 ms)</w:t>
+            </w:r>
+          </w:p>
+        </w:tc>
+        <w:tc>
+          <w:tcPr>
+            <w:tcW w:type="pct" w:w="14%"/>
+            <w:tcMar>
+              <w:top w:type="dxa" w:w="80"/>
+              <w:left w:type="dxa" w:w="110"/>
+              <w:bottom w:type="dxa" w:w="80"/>
+              <w:right w:type="dxa" w:w="110"/>
+            </w:tcMar>
+          </w:tcPr>
+          <w:p>
+            <w:pPr>
+              <w:spacing w:after="0"/>
+            </w:pPr>
+            <w:r>
+              <w:rPr>
+                <w:sz w:val="17"/>
+                <w:szCs w:val="17"/>
+              </w:rPr>
+              <w:t xml:space="preserve">144.2 ms  (160 ms)</w:t>
+            </w:r>
+          </w:p>
+        </w:tc>
+        <w:tc>
+          <w:tcPr>
+            <w:tcW w:type="pct" w:w="14%"/>
+            <w:tcMar>
+              <w:top w:type="dxa" w:w="80"/>
+              <w:left w:type="dxa" w:w="110"/>
+              <w:bottom w:type="dxa" w:w="80"/>
+              <w:right w:type="dxa" w:w="110"/>
+            </w:tcMar>
+          </w:tcPr>
+          <w:p>
+            <w:pPr>
+              <w:spacing w:after="0"/>
+            </w:pPr>
+            <w:r>
+              <w:rPr>
+                <w:sz w:val="17"/>
+                <w:szCs w:val="17"/>
+              </w:rPr>
+              <w:t xml:space="preserve">749.9 ms  (780.1 ms)</w:t>
             </w:r>
           </w:p>
         </w:tc>
@@ -773,53 +773,53 @@
                 <w:sz w:val="17"/>
                 <w:szCs w:val="17"/>
               </w:rPr>
-              <w:t xml:space="preserve">3.8 ms  (5.3 ms)</w:t>
-            </w:r>
-          </w:p>
-        </w:tc>
-        <w:tc>
-          <w:tcPr>
-            <w:tcW w:type="pct" w:w="14%"/>
-            <w:tcMar>
-              <w:top w:type="dxa" w:w="80"/>
-              <w:left w:type="dxa" w:w="110"/>
-              <w:bottom w:type="dxa" w:w="80"/>
-              <w:right w:type="dxa" w:w="110"/>
-            </w:tcMar>
-          </w:tcPr>
-          <w:p>
-            <w:pPr>
-              <w:spacing w:after="0"/>
-            </w:pPr>
-            <w:r>
-              <w:rPr>
-                <w:sz w:val="17"/>
-                <w:szCs w:val="17"/>
-              </w:rPr>
-              <w:t xml:space="preserve">16.4 ms  (20.7 ms)</w:t>
-            </w:r>
-          </w:p>
-        </w:tc>
-        <w:tc>
-          <w:tcPr>
-            <w:tcW w:type="pct" w:w="14%"/>
-            <w:tcMar>
-              <w:top w:type="dxa" w:w="80"/>
-              <w:left w:type="dxa" w:w="110"/>
-              <w:bottom w:type="dxa" w:w="80"/>
-              <w:right w:type="dxa" w:w="110"/>
-            </w:tcMar>
-          </w:tcPr>
-          <w:p>
-            <w:pPr>
-              <w:spacing w:after="0"/>
-            </w:pPr>
-            <w:r>
-              <w:rPr>
-                <w:sz w:val="17"/>
-                <w:szCs w:val="17"/>
-              </w:rPr>
-              <w:t xml:space="preserve">70.6 ms  (79.2 ms)</w:t>
+              <w:t xml:space="preserve">3.6 ms  (4.4 ms)</w:t>
+            </w:r>
+          </w:p>
+        </w:tc>
+        <w:tc>
+          <w:tcPr>
+            <w:tcW w:type="pct" w:w="14%"/>
+            <w:tcMar>
+              <w:top w:type="dxa" w:w="80"/>
+              <w:left w:type="dxa" w:w="110"/>
+              <w:bottom w:type="dxa" w:w="80"/>
+              <w:right w:type="dxa" w:w="110"/>
+            </w:tcMar>
+          </w:tcPr>
+          <w:p>
+            <w:pPr>
+              <w:spacing w:after="0"/>
+            </w:pPr>
+            <w:r>
+              <w:rPr>
+                <w:sz w:val="17"/>
+                <w:szCs w:val="17"/>
+              </w:rPr>
+              <w:t xml:space="preserve">15.8 ms  (16.3 ms)</w:t>
+            </w:r>
+          </w:p>
+        </w:tc>
+        <w:tc>
+          <w:tcPr>
+            <w:tcW w:type="pct" w:w="14%"/>
+            <w:tcMar>
+              <w:top w:type="dxa" w:w="80"/>
+              <w:left w:type="dxa" w:w="110"/>
+              <w:bottom w:type="dxa" w:w="80"/>
+              <w:right w:type="dxa" w:w="110"/>
+            </w:tcMar>
+          </w:tcPr>
+          <w:p>
+            <w:pPr>
+              <w:spacing w:after="0"/>
+            </w:pPr>
+            <w:r>
+              <w:rPr>
+                <w:sz w:val="17"/>
+                <w:szCs w:val="17"/>
+              </w:rPr>
+              <w:t xml:space="preserve">75.2 ms  (81 ms)</w:t>
             </w:r>
           </w:p>
         </w:tc>
@@ -893,53 +893,53 @@
                 <w:sz w:val="17"/>
                 <w:szCs w:val="17"/>
               </w:rPr>
-              <w:t xml:space="preserve">3 ms  (3.1 ms)</w:t>
-            </w:r>
-          </w:p>
-        </w:tc>
-        <w:tc>
-          <w:tcPr>
-            <w:tcW w:type="pct" w:w="14%"/>
-            <w:tcMar>
-              <w:top w:type="dxa" w:w="80"/>
-              <w:left w:type="dxa" w:w="110"/>
-              <w:bottom w:type="dxa" w:w="80"/>
-              <w:right w:type="dxa" w:w="110"/>
-            </w:tcMar>
-          </w:tcPr>
-          <w:p>
-            <w:pPr>
-              <w:spacing w:after="0"/>
-            </w:pPr>
-            <w:r>
-              <w:rPr>
-                <w:sz w:val="17"/>
-                <w:szCs w:val="17"/>
-              </w:rPr>
-              <w:t xml:space="preserve">11.3 ms  (11.7 ms)</w:t>
-            </w:r>
-          </w:p>
-        </w:tc>
-        <w:tc>
-          <w:tcPr>
-            <w:tcW w:type="pct" w:w="14%"/>
-            <w:tcMar>
-              <w:top w:type="dxa" w:w="80"/>
-              <w:left w:type="dxa" w:w="110"/>
-              <w:bottom w:type="dxa" w:w="80"/>
-              <w:right w:type="dxa" w:w="110"/>
-            </w:tcMar>
-          </w:tcPr>
-          <w:p>
-            <w:pPr>
-              <w:spacing w:after="0"/>
-            </w:pPr>
-            <w:r>
-              <w:rPr>
-                <w:sz w:val="17"/>
-                <w:szCs w:val="17"/>
-              </w:rPr>
-              <w:t xml:space="preserve">22.6 ms  (27.8 ms)</w:t>
+              <w:t xml:space="preserve">3 ms  (3.3 ms)</w:t>
+            </w:r>
+          </w:p>
+        </w:tc>
+        <w:tc>
+          <w:tcPr>
+            <w:tcW w:type="pct" w:w="14%"/>
+            <w:tcMar>
+              <w:top w:type="dxa" w:w="80"/>
+              <w:left w:type="dxa" w:w="110"/>
+              <w:bottom w:type="dxa" w:w="80"/>
+              <w:right w:type="dxa" w:w="110"/>
+            </w:tcMar>
+          </w:tcPr>
+          <w:p>
+            <w:pPr>
+              <w:spacing w:after="0"/>
+            </w:pPr>
+            <w:r>
+              <w:rPr>
+                <w:sz w:val="17"/>
+                <w:szCs w:val="17"/>
+              </w:rPr>
+              <w:t xml:space="preserve">8.3 ms  (8.6 ms)</w:t>
+            </w:r>
+          </w:p>
+        </w:tc>
+        <w:tc>
+          <w:tcPr>
+            <w:tcW w:type="pct" w:w="14%"/>
+            <w:tcMar>
+              <w:top w:type="dxa" w:w="80"/>
+              <w:left w:type="dxa" w:w="110"/>
+              <w:bottom w:type="dxa" w:w="80"/>
+              <w:right w:type="dxa" w:w="110"/>
+            </w:tcMar>
+          </w:tcPr>
+          <w:p>
+            <w:pPr>
+              <w:spacing w:after="0"/>
+            </w:pPr>
+            <w:r>
+              <w:rPr>
+                <w:sz w:val="17"/>
+                <w:szCs w:val="17"/>
+              </w:rPr>
+              <w:t xml:space="preserve">21.8 ms  (22.9 ms)</w:t>
             </w:r>
           </w:p>
         </w:tc>
@@ -1013,53 +1013,53 @@
                 <w:sz w:val="17"/>
                 <w:szCs w:val="17"/>
               </w:rPr>
-              <w:t xml:space="preserve">2.1 ms  (2.8 ms)</w:t>
-            </w:r>
-          </w:p>
-        </w:tc>
-        <w:tc>
-          <w:tcPr>
-            <w:tcW w:type="pct" w:w="14%"/>
-            <w:tcMar>
-              <w:top w:type="dxa" w:w="80"/>
-              <w:left w:type="dxa" w:w="110"/>
-              <w:bottom w:type="dxa" w:w="80"/>
-              <w:right w:type="dxa" w:w="110"/>
-            </w:tcMar>
-          </w:tcPr>
-          <w:p>
-            <w:pPr>
-              <w:spacing w:after="0"/>
-            </w:pPr>
-            <w:r>
-              <w:rPr>
-                <w:sz w:val="17"/>
-                <w:szCs w:val="17"/>
-              </w:rPr>
-              <w:t xml:space="preserve">2.3 ms  (3.5 ms)</w:t>
-            </w:r>
-          </w:p>
-        </w:tc>
-        <w:tc>
-          <w:tcPr>
-            <w:tcW w:type="pct" w:w="14%"/>
-            <w:tcMar>
-              <w:top w:type="dxa" w:w="80"/>
-              <w:left w:type="dxa" w:w="110"/>
-              <w:bottom w:type="dxa" w:w="80"/>
-              <w:right w:type="dxa" w:w="110"/>
-            </w:tcMar>
-          </w:tcPr>
-          <w:p>
-            <w:pPr>
-              <w:spacing w:after="0"/>
-            </w:pPr>
-            <w:r>
-              <w:rPr>
-                <w:sz w:val="17"/>
-                <w:szCs w:val="17"/>
-              </w:rPr>
-              <w:t xml:space="preserve">2.3 ms  (3 ms)</w:t>
+              <w:t xml:space="preserve">2.3 ms  (2.6 ms)</w:t>
+            </w:r>
+          </w:p>
+        </w:tc>
+        <w:tc>
+          <w:tcPr>
+            <w:tcW w:type="pct" w:w="14%"/>
+            <w:tcMar>
+              <w:top w:type="dxa" w:w="80"/>
+              <w:left w:type="dxa" w:w="110"/>
+              <w:bottom w:type="dxa" w:w="80"/>
+              <w:right w:type="dxa" w:w="110"/>
+            </w:tcMar>
+          </w:tcPr>
+          <w:p>
+            <w:pPr>
+              <w:spacing w:after="0"/>
+            </w:pPr>
+            <w:r>
+              <w:rPr>
+                <w:sz w:val="17"/>
+                <w:szCs w:val="17"/>
+              </w:rPr>
+              <w:t xml:space="preserve">2.1 ms  (2.6 ms)</w:t>
+            </w:r>
+          </w:p>
+        </w:tc>
+        <w:tc>
+          <w:tcPr>
+            <w:tcW w:type="pct" w:w="14%"/>
+            <w:tcMar>
+              <w:top w:type="dxa" w:w="80"/>
+              <w:left w:type="dxa" w:w="110"/>
+              <w:bottom w:type="dxa" w:w="80"/>
+              <w:right w:type="dxa" w:w="110"/>
+            </w:tcMar>
+          </w:tcPr>
+          <w:p>
+            <w:pPr>
+              <w:spacing w:after="0"/>
+            </w:pPr>
+            <w:r>
+              <w:rPr>
+                <w:sz w:val="17"/>
+                <w:szCs w:val="17"/>
+              </w:rPr>
+              <w:t xml:space="preserve">2 ms  (2.5 ms)</w:t>
             </w:r>
           </w:p>
         </w:tc>
@@ -1086,6 +1086,126 @@
                 <w:sz w:val="17"/>
                 <w:szCs w:val="17"/>
               </w:rPr>
+              <w:t xml:space="preserve">PDF/A archival copy of one record</w:t>
+            </w:r>
+          </w:p>
+        </w:tc>
+        <w:tc>
+          <w:tcPr>
+            <w:tcW w:type="pct" w:w="26%"/>
+            <w:tcMar>
+              <w:top w:type="dxa" w:w="80"/>
+              <w:left w:type="dxa" w:w="110"/>
+              <w:bottom w:type="dxa" w:w="80"/>
+              <w:right w:type="dxa" w:w="110"/>
+            </w:tcMar>
+          </w:tcPr>
+          <w:p>
+            <w:pPr>
+              <w:spacing w:after="0"/>
+            </w:pPr>
+            <w:r>
+              <w:rPr>
+                <w:color w:val="475569"/>
+                <w:sz w:val="17"/>
+                <w:szCs w:val="17"/>
+              </w:rPr>
+              <w:t xml:space="preserve">one per frozen record, inside the archive</w:t>
+            </w:r>
+          </w:p>
+        </w:tc>
+        <w:tc>
+          <w:tcPr>
+            <w:tcW w:type="pct" w:w="14%"/>
+            <w:tcMar>
+              <w:top w:type="dxa" w:w="80"/>
+              <w:left w:type="dxa" w:w="110"/>
+              <w:bottom w:type="dxa" w:w="80"/>
+              <w:right w:type="dxa" w:w="110"/>
+            </w:tcMar>
+          </w:tcPr>
+          <w:p>
+            <w:pPr>
+              <w:spacing w:after="0"/>
+            </w:pPr>
+            <w:r>
+              <w:rPr>
+                <w:sz w:val="17"/>
+                <w:szCs w:val="17"/>
+              </w:rPr>
+              <w:t xml:space="preserve">3.5 ms  (3.9 ms)</w:t>
+            </w:r>
+          </w:p>
+        </w:tc>
+        <w:tc>
+          <w:tcPr>
+            <w:tcW w:type="pct" w:w="14%"/>
+            <w:tcMar>
+              <w:top w:type="dxa" w:w="80"/>
+              <w:left w:type="dxa" w:w="110"/>
+              <w:bottom w:type="dxa" w:w="80"/>
+              <w:right w:type="dxa" w:w="110"/>
+            </w:tcMar>
+          </w:tcPr>
+          <w:p>
+            <w:pPr>
+              <w:spacing w:after="0"/>
+            </w:pPr>
+            <w:r>
+              <w:rPr>
+                <w:sz w:val="17"/>
+                <w:szCs w:val="17"/>
+              </w:rPr>
+              <w:t xml:space="preserve">3.4 ms  (3.9 ms)</w:t>
+            </w:r>
+          </w:p>
+        </w:tc>
+        <w:tc>
+          <w:tcPr>
+            <w:tcW w:type="pct" w:w="14%"/>
+            <w:tcMar>
+              <w:top w:type="dxa" w:w="80"/>
+              <w:left w:type="dxa" w:w="110"/>
+              <w:bottom w:type="dxa" w:w="80"/>
+              <w:right w:type="dxa" w:w="110"/>
+            </w:tcMar>
+          </w:tcPr>
+          <w:p>
+            <w:pPr>
+              <w:spacing w:after="0"/>
+            </w:pPr>
+            <w:r>
+              <w:rPr>
+                <w:sz w:val="17"/>
+                <w:szCs w:val="17"/>
+              </w:rPr>
+              <w:t xml:space="preserve">3.2 ms  (3.8 ms)</w:t>
+            </w:r>
+          </w:p>
+        </w:tc>
+      </w:tr>
+      <w:tr>
+        <w:tc>
+          <w:tcPr>
+            <w:tcW w:type="pct" w:w="30%"/>
+            <w:tcMar>
+              <w:top w:type="dxa" w:w="80"/>
+              <w:left w:type="dxa" w:w="110"/>
+              <w:bottom w:type="dxa" w:w="80"/>
+              <w:right w:type="dxa" w:w="110"/>
+            </w:tcMar>
+          </w:tcPr>
+          <w:p>
+            <w:pPr>
+              <w:spacing w:after="0"/>
+            </w:pPr>
+            <w:r>
+              <w:rPr>
+                <w:b/>
+                <w:bCs/>
+                <w:sz w:val="17"/>
+                <w:szCs w:val="17"/>
+              </w:rPr>
               <w:t xml:space="preserve">Full inspection archive</w:t>
             </w:r>
           </w:p>
@@ -1133,53 +1253,53 @@
                 <w:sz w:val="17"/>
                 <w:szCs w:val="17"/>
               </w:rPr>
-              <w:t xml:space="preserve">78 ms  (78 ms)</w:t>
-            </w:r>
-          </w:p>
-        </w:tc>
-        <w:tc>
-          <w:tcPr>
-            <w:tcW w:type="pct" w:w="14%"/>
-            <w:tcMar>
-              <w:top w:type="dxa" w:w="80"/>
-              <w:left w:type="dxa" w:w="110"/>
-              <w:bottom w:type="dxa" w:w="80"/>
-              <w:right w:type="dxa" w:w="110"/>
-            </w:tcMar>
-          </w:tcPr>
-          <w:p>
-            <w:pPr>
-              <w:spacing w:after="0"/>
-            </w:pPr>
-            <w:r>
-              <w:rPr>
-                <w:sz w:val="17"/>
-                <w:szCs w:val="17"/>
-              </w:rPr>
-              <w:t xml:space="preserve">490.4 ms  (490.4 ms)</w:t>
-            </w:r>
-          </w:p>
-        </w:tc>
-        <w:tc>
-          <w:tcPr>
-            <w:tcW w:type="pct" w:w="14%"/>
-            <w:tcMar>
-              <w:top w:type="dxa" w:w="80"/>
-              <w:left w:type="dxa" w:w="110"/>
-              <w:bottom w:type="dxa" w:w="80"/>
-              <w:right w:type="dxa" w:w="110"/>
-            </w:tcMar>
-          </w:tcPr>
-          <w:p>
-            <w:pPr>
-              <w:spacing w:after="0"/>
-            </w:pPr>
-            <w:r>
-              <w:rPr>
-                <w:sz w:val="17"/>
-                <w:szCs w:val="17"/>
-              </w:rPr>
-              <w:t xml:space="preserve">1.82 s  (1.82 s)</w:t>
+              <w:t xml:space="preserve">119.4 ms  (119.4 ms)</w:t>
+            </w:r>
+          </w:p>
+        </w:tc>
+        <w:tc>
+          <w:tcPr>
+            <w:tcW w:type="pct" w:w="14%"/>
+            <w:tcMar>
+              <w:top w:type="dxa" w:w="80"/>
+              <w:left w:type="dxa" w:w="110"/>
+              <w:bottom w:type="dxa" w:w="80"/>
+              <w:right w:type="dxa" w:w="110"/>
+            </w:tcMar>
+          </w:tcPr>
+          <w:p>
+            <w:pPr>
+              <w:spacing w:after="0"/>
+            </w:pPr>
+            <w:r>
+              <w:rPr>
+                <w:sz w:val="17"/>
+                <w:szCs w:val="17"/>
+              </w:rPr>
+              <w:t xml:space="preserve">457.3 ms  (457.3 ms)</w:t>
+            </w:r>
+          </w:p>
+        </w:tc>
+        <w:tc>
+          <w:tcPr>
+            <w:tcW w:type="pct" w:w="14%"/>
+            <w:tcMar>
+              <w:top w:type="dxa" w:w="80"/>
+              <w:left w:type="dxa" w:w="110"/>
+              <w:bottom w:type="dxa" w:w="80"/>
+              <w:right w:type="dxa" w:w="110"/>
+            </w:tcMar>
+          </w:tcPr>
+          <w:p>
+            <w:pPr>
+              <w:spacing w:after="0"/>
+            </w:pPr>
+            <w:r>
+              <w:rPr>
+                <w:sz w:val="17"/>
+                <w:szCs w:val="17"/>
+              </w:rPr>
+              <w:t xml:space="preserve">1.94 s  (1.94 s)</w:t>
             </w:r>
           </w:p>
         </w:tc>
@@ -1258,7 +1378,7 @@
                 <w:sz w:val="17"/>
                 <w:szCs w:val="17"/>
               </w:rPr>
-              <w:t xml:space="preserve">Audit chain verification is LINEAR, and the audit screen replays it IN FULL on every display: 14.7 ms for 1,031 entries, 802.3 ms for 50,143. With the display query, the page costs about 873 ms at the last step. It is the only point that degrades noticeably, and it is a deliberate choice: the chain is re-read in full so that the “chain intact” banner covers the whole trail, not just its tail.</w:t>
+              <w:t xml:space="preserve">Audit chain verification is LINEAR, and the audit screen replays it IN FULL on every display: 15.7 ms for 1,031 entries, 749.9 ms for 50,143. With the display query, the page costs about 825 ms at the last step. It is the only point that degrades noticeably, and it is a deliberate choice: the chain is re-read in full so that the “chain intact” banner covers the whole trail, not just its tail.</w:t>
             </w:r>
           </w:p>
         </w:tc>
@@ -1285,7 +1405,7 @@
           <w:sz w:val="20"/>
           <w:szCs w:val="20"/>
         </w:rPr>
-        <w:t xml:space="preserve">— WRITING DOES NOT DEGRADE. Appending an entry to the trail costs 2.1 ms on a fresh database and 2.3 ms on a trail of 50,143 entries. Chaining reads the head of the chain, not the chain: the cost is constant whatever the age of the installation.</w:t>
+        <w:t xml:space="preserve">— WRITING DOES NOT DEGRADE. Appending an entry to the trail costs 2.3 ms on a fresh database and 2 ms on a trail of 50,143 entries. Chaining reads the head of the chain, not the chain: the cost is constant whatever the age of the installation.</w:t>
       </w:r>
     </w:p>
     <w:p>
@@ -1309,7 +1429,19 @@
           <w:sz w:val="20"/>
           <w:szCs w:val="20"/>
         </w:rPr>
-        <w:t xml:space="preserve">— THE INSPECTION ARCHIVE is the most expensive operation in absolute terms (1.82 s at the last step), and that is of no consequence: it is triggered on demand, for an auditor, once per inspection campaign — not on every click.</w:t>
+        <w:t xml:space="preserve">— THE INSPECTION ARCHIVE is the most expensive operation in absolute terms (1.94 s at the last step), and that is of no consequence: it is triggered on demand, for an auditor, once per inspection campaign — not on every click.</w:t>
+      </w:r>
+    </w:p>
+    <w:p>
+      <w:pPr>
+        <w:spacing w:after="120"/>
+      </w:pPr>
+      <w:r>
+        <w:rPr>
+          <w:sz w:val="20"/>
+          <w:szCs w:val="20"/>
+        </w:rPr>
+        <w:t xml:space="preserve">— THE PDF/A ARCHIVAL COPY DOES NOT COST WHAT ONE MIGHT THINK. It is produced once per frozen record, in 3.2 ms, and that cost does not move with the size of the database: it depends on the document's size, not on the age of the installation. Across 200 documents it did not change the archive's order of magnitude — the spread between two successive archive runs is of the same order as what it adds.</w:t>
       </w:r>
     </w:p>
     <w:p>
@@ -1330,7 +1462,7 @@
           <w:sz w:val="20"/>
           <w:szCs w:val="20"/>
         </w:rPr>
-        <w:t xml:space="preserve">The software was measured up to 50,143 audit trail entries, 800 requirements and 200 documents. Within that domain, no operation exceeded 1.82 s. Beyond it, behaviour is not characterised: it is expected to stay linear for chain verification, but an expectation is not a measurement.</w:t>
+        <w:t xml:space="preserve">The software was measured up to 50,143 audit trail entries, 800 requirements and 200 documents. Within that domain, no operation exceeded 1.94 s. Beyond it, behaviour is not characterised: it is expected to stay linear for chain verification, but an expectation is not a measurement.</w:t>
       </w:r>
     </w:p>
     <w:p>

</xml_diff>